<commit_message>
finished split triangle for CS350 Assignment4
</commit_message>
<xml_diff>
--- a/CS205/Paper2_draft.docx
+++ b/CS205/Paper2_draft.docx
@@ -99,7 +99,23 @@
             <w:sz w:val="16"/>
             <w:szCs w:val="16"/>
           </w:rPr>
-          <w:t>https://www.pbs.org/independentlens/documentaries/coded-bias/ (11)</w:t>
+          <w:t>https://www.pbs.org/independentlens/documentaries/cod</w:t>
+        </w:r>
+        <w:r>
+          <w:rPr>
+            <w:rStyle w:val="Hyperlink"/>
+            <w:sz w:val="16"/>
+            <w:szCs w:val="16"/>
+          </w:rPr>
+          <w:t>e</w:t>
+        </w:r>
+        <w:r>
+          <w:rPr>
+            <w:rStyle w:val="Hyperlink"/>
+            <w:sz w:val="16"/>
+            <w:szCs w:val="16"/>
+          </w:rPr>
+          <w:t>d-bias/ (11)</w:t>
         </w:r>
       </w:hyperlink>
       <w:r>
@@ -469,7 +485,23 @@
           <w:sz w:val="20"/>
           <w:szCs w:val="20"/>
         </w:rPr>
-        <w:t>In the united states - “</w:t>
+        <w:t xml:space="preserve">In the </w:t>
+      </w:r>
+      <w:proofErr w:type="gramStart"/>
+      <w:r>
+        <w:rPr>
+          <w:sz w:val="20"/>
+          <w:szCs w:val="20"/>
+        </w:rPr>
+        <w:t>united states</w:t>
+      </w:r>
+      <w:proofErr w:type="gramEnd"/>
+      <w:r>
+        <w:rPr>
+          <w:sz w:val="20"/>
+          <w:szCs w:val="20"/>
+        </w:rPr>
+        <w:t xml:space="preserve"> - “</w:t>
       </w:r>
       <w:r>
         <w:rPr>
@@ -492,7 +524,23 @@
             <w:sz w:val="20"/>
             <w:szCs w:val="20"/>
           </w:rPr>
-          <w:t>https://legalclarity.org/how-are-police-departments-funded-by-taxes/ (7)</w:t>
+          <w:t>https://l</w:t>
+        </w:r>
+        <w:r>
+          <w:rPr>
+            <w:rStyle w:val="Hyperlink"/>
+            <w:sz w:val="20"/>
+            <w:szCs w:val="20"/>
+          </w:rPr>
+          <w:t>e</w:t>
+        </w:r>
+        <w:r>
+          <w:rPr>
+            <w:rStyle w:val="Hyperlink"/>
+            <w:sz w:val="20"/>
+            <w:szCs w:val="20"/>
+          </w:rPr>
+          <w:t>galclarity.org/how-are-police-departments-funded-by-taxes/ (7)</w:t>
         </w:r>
       </w:hyperlink>
     </w:p>
@@ -513,7 +561,23 @@
           <w:sz w:val="20"/>
           <w:szCs w:val="20"/>
         </w:rPr>
-        <w:t>In the united states - “</w:t>
+        <w:t xml:space="preserve">In the </w:t>
+      </w:r>
+      <w:proofErr w:type="gramStart"/>
+      <w:r>
+        <w:rPr>
+          <w:sz w:val="20"/>
+          <w:szCs w:val="20"/>
+        </w:rPr>
+        <w:t>united states</w:t>
+      </w:r>
+      <w:proofErr w:type="gramEnd"/>
+      <w:r>
+        <w:rPr>
+          <w:sz w:val="20"/>
+          <w:szCs w:val="20"/>
+        </w:rPr>
+        <w:t xml:space="preserve"> - “</w:t>
       </w:r>
       <w:r>
         <w:rPr>
@@ -847,6 +911,7 @@
         </w:rPr>
         <w:t xml:space="preserve">Large tech companies responsible for developing and selling AI models across all industries make the exposed harm possible. These organizations control vast amounts of wealth and </w:t>
       </w:r>
+      <w:proofErr w:type="gramStart"/>
       <w:r>
         <w:rPr>
           <w:sz w:val="16"/>
@@ -866,7 +931,15 @@
           <w:sz w:val="16"/>
           <w:szCs w:val="16"/>
         </w:rPr>
-        <w:t xml:space="preserve">in </w:t>
+        <w:t>in</w:t>
+      </w:r>
+      <w:proofErr w:type="gramEnd"/>
+      <w:r>
+        <w:rPr>
+          <w:sz w:val="16"/>
+          <w:szCs w:val="16"/>
+        </w:rPr>
+        <w:t xml:space="preserve"> </w:t>
       </w:r>
       <w:r>
         <w:rPr>
@@ -944,7 +1017,39 @@
           <w:sz w:val="20"/>
           <w:szCs w:val="20"/>
         </w:rPr>
-        <w:t>The purpose of a corporation is to conduct a lawful, ethical, profitable and sustainable business in order to ensure its success and grow its value over the long term. This requires consideration of all the stakeholders that are critical to its success (shareholders, employees, customers, suppliers and communities), as determined by the corporation and its board of directors using their business judgment and with regular engagement with shareholders, who are essential partners in supporting the corporation’s pursuit of its purpose. Fulfilling this purpose in such manner is fully consistent with the fiduciary duties of the board of directors and the stewardship obligations of shareholders.</w:t>
+        <w:t xml:space="preserve">The purpose of a corporation is to conduct a lawful, ethical, profitable and sustainable business </w:t>
+      </w:r>
+      <w:proofErr w:type="gramStart"/>
+      <w:r>
+        <w:rPr>
+          <w:sz w:val="20"/>
+          <w:szCs w:val="20"/>
+        </w:rPr>
+        <w:t>in order to</w:t>
+      </w:r>
+      <w:proofErr w:type="gramEnd"/>
+      <w:r>
+        <w:rPr>
+          <w:sz w:val="20"/>
+          <w:szCs w:val="20"/>
+        </w:rPr>
+        <w:t xml:space="preserve"> ensure its success and grow its value over the long term. This requires consideration of all the stakeholders that are critical to </w:t>
+      </w:r>
+      <w:proofErr w:type="gramStart"/>
+      <w:r>
+        <w:rPr>
+          <w:sz w:val="20"/>
+          <w:szCs w:val="20"/>
+        </w:rPr>
+        <w:t>its</w:t>
+      </w:r>
+      <w:proofErr w:type="gramEnd"/>
+      <w:r>
+        <w:rPr>
+          <w:sz w:val="20"/>
+          <w:szCs w:val="20"/>
+        </w:rPr>
+        <w:t xml:space="preserve"> success (shareholders, employees, customers, suppliers and communities), as determined by the corporation and its board of directors using their business judgment and with regular engagement with shareholders, who are essential partners in supporting the corporation’s pursuit of its purpose. Fulfilling this purpose in such manner is fully consistent with the fiduciary duties of the board of directors and the stewardship obligations of shareholders.</w:t>
       </w:r>
       <w:r>
         <w:rPr>
@@ -960,7 +1065,23 @@
             <w:sz w:val="20"/>
             <w:szCs w:val="20"/>
           </w:rPr>
-          <w:t>https://corpgov.law.harvard.edu/2020/09/17/the-friedman-essay-and-the-true-purpose-of-the-business-corporation/ (8)</w:t>
+          <w:t>https://corpgov.law.harvard.edu/2020/09/17/the-friedman-essay-and-the-true-purpose-of-the-business-corporation/</w:t>
+        </w:r>
+        <w:r>
+          <w:rPr>
+            <w:rStyle w:val="Hyperlink"/>
+            <w:sz w:val="20"/>
+            <w:szCs w:val="20"/>
+          </w:rPr>
+          <w:t xml:space="preserve"> </w:t>
+        </w:r>
+        <w:r>
+          <w:rPr>
+            <w:rStyle w:val="Hyperlink"/>
+            <w:sz w:val="20"/>
+            <w:szCs w:val="20"/>
+          </w:rPr>
+          <w:t>(8)</w:t>
         </w:r>
       </w:hyperlink>
     </w:p>
@@ -1192,7 +1313,39 @@
           <w:sz w:val="20"/>
           <w:szCs w:val="20"/>
         </w:rPr>
-        <w:t>Their role is to contain legislative subsystems which are knowledgeable of each and every industry that exists within their domain. These subsystems must remain up to date with their particular industry, and produce legislation which provides meaningful guidelines for that industry.</w:t>
+        <w:t xml:space="preserve">Their role is to contain legislative subsystems which are knowledgeable of </w:t>
+      </w:r>
+      <w:proofErr w:type="gramStart"/>
+      <w:r>
+        <w:rPr>
+          <w:sz w:val="20"/>
+          <w:szCs w:val="20"/>
+        </w:rPr>
+        <w:t>each and every</w:t>
+      </w:r>
+      <w:proofErr w:type="gramEnd"/>
+      <w:r>
+        <w:rPr>
+          <w:sz w:val="20"/>
+          <w:szCs w:val="20"/>
+        </w:rPr>
+        <w:t xml:space="preserve"> industry that exists within their domain. These subsystems must remain up to date with their particular </w:t>
+      </w:r>
+      <w:proofErr w:type="gramStart"/>
+      <w:r>
+        <w:rPr>
+          <w:sz w:val="20"/>
+          <w:szCs w:val="20"/>
+        </w:rPr>
+        <w:t>industry, and</w:t>
+      </w:r>
+      <w:proofErr w:type="gramEnd"/>
+      <w:r>
+        <w:rPr>
+          <w:sz w:val="20"/>
+          <w:szCs w:val="20"/>
+        </w:rPr>
+        <w:t xml:space="preserve"> produce legislation which provides meaningful guidelines for that industry.</w:t>
       </w:r>
     </w:p>
     <w:p>
@@ -1218,12 +1371,21 @@
           <w:szCs w:val="20"/>
         </w:rPr>
       </w:pPr>
-      <w:r>
-        <w:rPr>
-          <w:sz w:val="20"/>
-          <w:szCs w:val="20"/>
-        </w:rPr>
-        <w:t>Section2: problem description</w:t>
+      <w:proofErr w:type="gramStart"/>
+      <w:r>
+        <w:rPr>
+          <w:sz w:val="20"/>
+          <w:szCs w:val="20"/>
+        </w:rPr>
+        <w:t>Section2</w:t>
+      </w:r>
+      <w:proofErr w:type="gramEnd"/>
+      <w:r>
+        <w:rPr>
+          <w:sz w:val="20"/>
+          <w:szCs w:val="20"/>
+        </w:rPr>
+        <w:t>: problem description</w:t>
       </w:r>
     </w:p>
     <w:p>
@@ -1259,7 +1421,23 @@
           <w:sz w:val="16"/>
           <w:szCs w:val="16"/>
         </w:rPr>
-        <w:t>Coded Bias explores the weaknesses of machine learning algorithms and the harm being caused by the hasty implementation of such algorithms in various sectors of society. But ultimately focuses on three main observations.</w:t>
+        <w:t xml:space="preserve">Coded Bias explores the weaknesses of machine learning algorithms and the harm being caused by the hasty implementation of such algorithms in various sectors of society. But </w:t>
+      </w:r>
+      <w:proofErr w:type="gramStart"/>
+      <w:r>
+        <w:rPr>
+          <w:sz w:val="16"/>
+          <w:szCs w:val="16"/>
+        </w:rPr>
+        <w:t>ultimately</w:t>
+      </w:r>
+      <w:proofErr w:type="gramEnd"/>
+      <w:r>
+        <w:rPr>
+          <w:sz w:val="16"/>
+          <w:szCs w:val="16"/>
+        </w:rPr>
+        <w:t xml:space="preserve"> focuses on three main observations.</w:t>
       </w:r>
     </w:p>
     <w:p>
@@ -1446,7 +1624,23 @@
             <w:sz w:val="20"/>
             <w:szCs w:val="20"/>
           </w:rPr>
-          <w:t>https://direct.mit.edu/coli/article/50/3/1097/121961/Bias-and-Fairness-in-Large-Language-Models-A (0)</w:t>
+          <w:t>https://direct.mit.edu/coli/article/</w:t>
+        </w:r>
+        <w:r>
+          <w:rPr>
+            <w:rStyle w:val="Hyperlink"/>
+            <w:sz w:val="20"/>
+            <w:szCs w:val="20"/>
+          </w:rPr>
+          <w:t>5</w:t>
+        </w:r>
+        <w:r>
+          <w:rPr>
+            <w:rStyle w:val="Hyperlink"/>
+            <w:sz w:val="20"/>
+            <w:szCs w:val="20"/>
+          </w:rPr>
+          <w:t>0/3/1097/121961/Bias-and-Fairness-in-Large-Language-Models-A (0)</w:t>
         </w:r>
       </w:hyperlink>
     </w:p>
@@ -1532,7 +1726,23 @@
           <w:sz w:val="20"/>
           <w:szCs w:val="20"/>
         </w:rPr>
-        <w:t>Benchmark datasets may be unrepresentative of the population that will use the LLM, but can steer development towards optimizing only for those represented by the benchmark. The choice of metric can also convey different properties of the model, such as with aggregate measures that obscure disparate performance between social groups, or the selection of which measure to report (e.g., false positives versus false negatives).</w:t>
+        <w:t xml:space="preserve">Benchmark datasets may be unrepresentative of the population that will use the </w:t>
+      </w:r>
+      <w:proofErr w:type="gramStart"/>
+      <w:r>
+        <w:rPr>
+          <w:sz w:val="20"/>
+          <w:szCs w:val="20"/>
+        </w:rPr>
+        <w:t>LLM, but</w:t>
+      </w:r>
+      <w:proofErr w:type="gramEnd"/>
+      <w:r>
+        <w:rPr>
+          <w:sz w:val="20"/>
+          <w:szCs w:val="20"/>
+        </w:rPr>
+        <w:t xml:space="preserve"> can steer development towards optimizing only for those represented by the benchmark. The choice of metric can also convey different properties of the model, such as with aggregate measures that obscure disparate performance between social groups, or the selection of which measure to report (e.g., false positives versus false negatives).</w:t>
       </w:r>
       <w:r>
         <w:rPr>
@@ -1562,7 +1772,23 @@
           <w:sz w:val="16"/>
           <w:szCs w:val="16"/>
         </w:rPr>
-        <w:t xml:space="preserve">Aside from our own biases, the standards which guide our testing of models is subject to bias as well. Datasets used to measure success might fail to accurately represent the population which the model will be used on. </w:t>
+        <w:t xml:space="preserve">Aside from our own biases, the standards which guide our testing of models </w:t>
+      </w:r>
+      <w:proofErr w:type="gramStart"/>
+      <w:r>
+        <w:rPr>
+          <w:sz w:val="16"/>
+          <w:szCs w:val="16"/>
+        </w:rPr>
+        <w:t>is</w:t>
+      </w:r>
+      <w:proofErr w:type="gramEnd"/>
+      <w:r>
+        <w:rPr>
+          <w:sz w:val="16"/>
+          <w:szCs w:val="16"/>
+        </w:rPr>
+        <w:t xml:space="preserve"> subject to bias as well. Datasets used to measure success might fail to accurately represent the population which the model will be used on. </w:t>
       </w:r>
       <w:r>
         <w:rPr>
@@ -1670,6 +1896,127 @@
         </w:rPr>
         <w:tab/>
         <w:t>Subsection2.2: salient issue (use of facial recognition in law enforcement surveillance)</w:t>
+      </w:r>
+    </w:p>
+    <w:p>
+      <w:pPr>
+        <w:ind w:left="720"/>
+        <w:rPr>
+          <w:sz w:val="16"/>
+          <w:szCs w:val="16"/>
+        </w:rPr>
+      </w:pPr>
+      <w:r>
+        <w:rPr>
+          <w:sz w:val="16"/>
+          <w:szCs w:val="16"/>
+        </w:rPr>
+        <w:t>In t</w:t>
+      </w:r>
+      <w:r>
+        <w:rPr>
+          <w:sz w:val="16"/>
+          <w:szCs w:val="16"/>
+        </w:rPr>
+        <w:t>he</w:t>
+      </w:r>
+      <w:r>
+        <w:rPr>
+          <w:sz w:val="16"/>
+          <w:szCs w:val="16"/>
+        </w:rPr>
+        <w:t xml:space="preserve"> film, the</w:t>
+      </w:r>
+      <w:r>
+        <w:rPr>
+          <w:sz w:val="16"/>
+          <w:szCs w:val="16"/>
+        </w:rPr>
+        <w:t xml:space="preserve"> main example used </w:t>
+      </w:r>
+      <w:r>
+        <w:rPr>
+          <w:sz w:val="16"/>
+          <w:szCs w:val="16"/>
+        </w:rPr>
+        <w:t>to represent the harms of bias automation is that of</w:t>
+      </w:r>
+      <w:r>
+        <w:rPr>
+          <w:sz w:val="16"/>
+          <w:szCs w:val="16"/>
+        </w:rPr>
+        <w:t xml:space="preserve"> </w:t>
+      </w:r>
+      <w:r>
+        <w:rPr>
+          <w:sz w:val="16"/>
+          <w:szCs w:val="16"/>
+        </w:rPr>
+        <w:t>law enforcement</w:t>
+      </w:r>
+      <w:r>
+        <w:rPr>
+          <w:sz w:val="16"/>
+          <w:szCs w:val="16"/>
+        </w:rPr>
+        <w:t xml:space="preserve"> in the United States</w:t>
+      </w:r>
+      <w:r>
+        <w:rPr>
+          <w:sz w:val="16"/>
+          <w:szCs w:val="16"/>
+        </w:rPr>
+        <w:t xml:space="preserve">. </w:t>
+      </w:r>
+      <w:r>
+        <w:rPr>
+          <w:sz w:val="16"/>
+          <w:szCs w:val="16"/>
+        </w:rPr>
+        <w:t>“Seven law enforcement agencies within the Departments of Justice (DOJ) and Homeland Security (DHS), such as the Federal Bureau of Investigation and U.S. Secret Service, reported using facial recognition technology to support criminal investigations.” (1)</w:t>
+      </w:r>
+      <w:r>
+        <w:rPr>
+          <w:sz w:val="16"/>
+          <w:szCs w:val="16"/>
+        </w:rPr>
+        <w:t xml:space="preserve"> It was similarly reported that all seven of these organizations employed systems created by other entities including some that were privately owned. Legal systems are delicate and complicated. The addition of such untested tools in such inflammatory environments is </w:t>
+      </w:r>
+      <w:r>
+        <w:rPr>
+          <w:sz w:val="16"/>
+          <w:szCs w:val="16"/>
+        </w:rPr>
+        <w:t>a recipe for disaster.</w:t>
+      </w:r>
+      <w:r>
+        <w:rPr>
+          <w:sz w:val="16"/>
+          <w:szCs w:val="16"/>
+        </w:rPr>
+        <w:t xml:space="preserve"> The documentary highlights the </w:t>
+      </w:r>
+      <w:r>
+        <w:rPr>
+          <w:sz w:val="16"/>
+          <w:szCs w:val="16"/>
+        </w:rPr>
+        <w:t>dangers to people’s</w:t>
+      </w:r>
+      <w:r>
+        <w:rPr>
+          <w:sz w:val="16"/>
+          <w:szCs w:val="16"/>
+        </w:rPr>
+        <w:t xml:space="preserve"> right to privacy.</w:t>
+      </w:r>
+      <w:r>
+        <w:rPr>
+          <w:sz w:val="16"/>
+          <w:szCs w:val="16"/>
+        </w:rPr>
+        <w:t xml:space="preserve"> As we will discuss in the next section, the suggested solution to this risk is to tighten legislation around the use of automated systems. </w:t>
       </w:r>
     </w:p>
     <w:p>
@@ -1712,7 +2059,23 @@
             <w:sz w:val="20"/>
             <w:szCs w:val="20"/>
           </w:rPr>
-          <w:t>https://www.gao.gov/products/gao-24-107372 (1)</w:t>
+          <w:t>https://www.gao.gov/p</w:t>
+        </w:r>
+        <w:r>
+          <w:rPr>
+            <w:rStyle w:val="Hyperlink"/>
+            <w:sz w:val="20"/>
+            <w:szCs w:val="20"/>
+          </w:rPr>
+          <w:t>r</w:t>
+        </w:r>
+        <w:r>
+          <w:rPr>
+            <w:rStyle w:val="Hyperlink"/>
+            <w:sz w:val="20"/>
+            <w:szCs w:val="20"/>
+          </w:rPr>
+          <w:t>oducts/gao-24-107372 (1)</w:t>
         </w:r>
       </w:hyperlink>
     </w:p>
@@ -1771,8 +2134,80 @@
           <w:sz w:val="20"/>
           <w:szCs w:val="20"/>
         </w:rPr>
+        <w:lastRenderedPageBreak/>
         <w:tab/>
         <w:t>Subsection2.3: salient issue (lack of regulation for machine learning and algorithmic recognition software)</w:t>
+      </w:r>
+    </w:p>
+    <w:p>
+      <w:pPr>
+        <w:rPr>
+          <w:sz w:val="16"/>
+          <w:szCs w:val="16"/>
+        </w:rPr>
+      </w:pPr>
+      <w:r>
+        <w:rPr>
+          <w:sz w:val="20"/>
+          <w:szCs w:val="20"/>
+        </w:rPr>
+        <w:tab/>
+      </w:r>
+      <w:r>
+        <w:rPr>
+          <w:sz w:val="16"/>
+          <w:szCs w:val="16"/>
+        </w:rPr>
+        <w:t xml:space="preserve">In the United States, the Government Accountability Office found that three of the seven law enforcement organizations discussed in the previous section had policies or standards in place for how to respect civil rights and liberties while employing facial recognition systems. </w:t>
+      </w:r>
+      <w:r>
+        <w:rPr>
+          <w:sz w:val="16"/>
+          <w:szCs w:val="16"/>
+        </w:rPr>
+        <w:t xml:space="preserve">But the others, and many more clients of automation do not have such guidelines for using the new tools. Considering the issue at hand is legislation, it’s even more alarming that organizations like the DOJ </w:t>
+      </w:r>
+      <w:r>
+        <w:rPr>
+          <w:sz w:val="16"/>
+          <w:szCs w:val="16"/>
+        </w:rPr>
+        <w:t>don’t</w:t>
+      </w:r>
+      <w:r>
+        <w:rPr>
+          <w:sz w:val="16"/>
+          <w:szCs w:val="16"/>
+        </w:rPr>
+        <w:t xml:space="preserve"> rigorously imposed policies on how to use automation. Coded Bias urges the world to </w:t>
+      </w:r>
+      <w:r>
+        <w:rPr>
+          <w:sz w:val="16"/>
+          <w:szCs w:val="16"/>
+        </w:rPr>
+        <w:t>see this and testifies before c</w:t>
+      </w:r>
+      <w:r>
+        <w:rPr>
+          <w:sz w:val="16"/>
+          <w:szCs w:val="16"/>
+        </w:rPr>
+        <w:t xml:space="preserve">ongress to push for legislation </w:t>
+      </w:r>
+      <w:r>
+        <w:rPr>
+          <w:sz w:val="16"/>
+          <w:szCs w:val="16"/>
+        </w:rPr>
+        <w:t>for</w:t>
+      </w:r>
+      <w:r>
+        <w:rPr>
+          <w:sz w:val="16"/>
+          <w:szCs w:val="16"/>
+        </w:rPr>
+        <w:t xml:space="preserve"> facial recognition in the United States.</w:t>
       </w:r>
     </w:p>
     <w:p>
@@ -1799,7 +2234,39 @@
           <w:sz w:val="20"/>
           <w:szCs w:val="20"/>
         </w:rPr>
-        <w:t>In September 2023, GAO found that three of the seven agencies had policies or guidance specific to facial recognition technology that were intended to help protect civil rights and civil liberties. The other four agencies—three in DOJ and one in DHS—did not have such policies or guidance. We also found that DOJ had taken steps to issue a department-wide policy but had faced delays.</w:t>
+        <w:t xml:space="preserve">In September 2023, GAO found that three of the seven agencies had policies or guidance specific to facial recognition technology that were intended to help protect civil rights and civil liberties. The other four </w:t>
+      </w:r>
+      <w:proofErr w:type="gramStart"/>
+      <w:r>
+        <w:rPr>
+          <w:sz w:val="20"/>
+          <w:szCs w:val="20"/>
+        </w:rPr>
+        <w:t>agencies—</w:t>
+      </w:r>
+      <w:proofErr w:type="gramEnd"/>
+      <w:r>
+        <w:rPr>
+          <w:sz w:val="20"/>
+          <w:szCs w:val="20"/>
+        </w:rPr>
+        <w:t xml:space="preserve">three in DOJ and one in </w:t>
+      </w:r>
+      <w:proofErr w:type="gramStart"/>
+      <w:r>
+        <w:rPr>
+          <w:sz w:val="20"/>
+          <w:szCs w:val="20"/>
+        </w:rPr>
+        <w:t>DHS—</w:t>
+      </w:r>
+      <w:proofErr w:type="gramEnd"/>
+      <w:r>
+        <w:rPr>
+          <w:sz w:val="20"/>
+          <w:szCs w:val="20"/>
+        </w:rPr>
+        <w:t>did not have such policies or guidance. We also found that DOJ had taken steps to issue a department-wide policy but had faced delays.</w:t>
       </w:r>
       <w:r>
         <w:rPr>
@@ -1821,7 +2288,6 @@
           <w:sz w:val="20"/>
           <w:szCs w:val="20"/>
         </w:rPr>
-        <w:lastRenderedPageBreak/>
         <w:t>Section3: technological background</w:t>
       </w:r>
     </w:p>
@@ -1890,7 +2356,23 @@
           <w:sz w:val="16"/>
           <w:szCs w:val="16"/>
         </w:rPr>
-        <w:t>Machine learning is a broad field of computer science. The specific branch of ML which allows for sophisticated surveillance techniques such as facial recognition is called deep learning. Deep learning utilizes massive structures of artificial neurons known as neural networks. There are two main types of neural networks used today. Fully Connected Neural Networks and Convolutional Neural Networks(CNN). CNNs are known for their enhanced ability to process and recognize visual patterns within images and videos.</w:t>
+        <w:t xml:space="preserve">Machine learning is a broad field of computer science. The specific branch of ML which allows for sophisticated surveillance techniques such as facial recognition is called deep learning. Deep learning utilizes massive structures of artificial neurons known as neural networks. There are two main types of neural networks used today. Fully Connected Neural Networks and Convolutional Neural </w:t>
+      </w:r>
+      <w:proofErr w:type="gramStart"/>
+      <w:r>
+        <w:rPr>
+          <w:sz w:val="16"/>
+          <w:szCs w:val="16"/>
+        </w:rPr>
+        <w:t>Networks(</w:t>
+      </w:r>
+      <w:proofErr w:type="gramEnd"/>
+      <w:r>
+        <w:rPr>
+          <w:sz w:val="16"/>
+          <w:szCs w:val="16"/>
+        </w:rPr>
+        <w:t>CNN). CNNs are known for their enhanced ability to process and recognize visual patterns within images and videos.</w:t>
       </w:r>
     </w:p>
     <w:p>
@@ -1947,7 +2429,23 @@
           <w:sz w:val="20"/>
           <w:szCs w:val="20"/>
         </w:rPr>
-        <w:t>It is the first and probably the most essential step for facial recognition, and is used to extract human faces from digital images.</w:t>
+        <w:t xml:space="preserve">It is the first and probably the most essential step for facial </w:t>
+      </w:r>
+      <w:proofErr w:type="gramStart"/>
+      <w:r>
+        <w:rPr>
+          <w:sz w:val="20"/>
+          <w:szCs w:val="20"/>
+        </w:rPr>
+        <w:t>recognition, and</w:t>
+      </w:r>
+      <w:proofErr w:type="gramEnd"/>
+      <w:r>
+        <w:rPr>
+          <w:sz w:val="20"/>
+          <w:szCs w:val="20"/>
+        </w:rPr>
+        <w:t xml:space="preserve"> is used to extract human faces from digital images.</w:t>
       </w:r>
       <w:r>
         <w:rPr>
@@ -1963,7 +2461,7 @@
             <w:sz w:val="20"/>
             <w:szCs w:val="20"/>
           </w:rPr>
-          <w:t>https://www.differencebetween.net/technology</w:t>
+          <w:t>https://www.differencebetween.net/technology/difference-between-face-detection-and-face-reco</w:t>
         </w:r>
         <w:r>
           <w:rPr>
@@ -1971,7 +2469,7 @@
             <w:sz w:val="20"/>
             <w:szCs w:val="20"/>
           </w:rPr>
-          <w:t>/</w:t>
+          <w:t>g</w:t>
         </w:r>
         <w:r>
           <w:rPr>
@@ -1979,7 +2477,7 @@
             <w:sz w:val="20"/>
             <w:szCs w:val="20"/>
           </w:rPr>
-          <w:t>difference-between-face-detection-and-face-recognition/ (10)</w:t>
+          <w:t>nition/ (10)</w:t>
         </w:r>
       </w:hyperlink>
     </w:p>
@@ -2004,6 +2502,43 @@
           <w:szCs w:val="16"/>
         </w:rPr>
         <w:t>sophisticated functionality.</w:t>
+      </w:r>
+      <w:r>
+        <w:rPr>
+          <w:sz w:val="16"/>
+          <w:szCs w:val="16"/>
+        </w:rPr>
+        <w:t xml:space="preserve"> This usually means finding the specified object within the image or video frame and defining a bounding box which encapsulates the entire entity. F</w:t>
+      </w:r>
+      <w:r>
+        <w:rPr>
+          <w:sz w:val="16"/>
+          <w:szCs w:val="16"/>
+        </w:rPr>
+        <w:t xml:space="preserve">ace detection is simply using object detection to find faces. </w:t>
+      </w:r>
+      <w:r>
+        <w:rPr>
+          <w:sz w:val="16"/>
+          <w:szCs w:val="16"/>
+        </w:rPr>
+        <w:t xml:space="preserve">“It is the first and probably the most essential step for facial </w:t>
+      </w:r>
+      <w:proofErr w:type="gramStart"/>
+      <w:r>
+        <w:rPr>
+          <w:sz w:val="16"/>
+          <w:szCs w:val="16"/>
+        </w:rPr>
+        <w:t>recognition, and</w:t>
+      </w:r>
+      <w:proofErr w:type="gramEnd"/>
+      <w:r>
+        <w:rPr>
+          <w:sz w:val="16"/>
+          <w:szCs w:val="16"/>
+        </w:rPr>
+        <w:t xml:space="preserve"> is used to extract human faces from digital images.” (10)</w:t>
       </w:r>
     </w:p>
     <w:p>
@@ -2097,9 +2632,105 @@
             <w:sz w:val="20"/>
             <w:szCs w:val="20"/>
           </w:rPr>
-          <w:t>https://www.algoface.ai/face-recognition-vs-face-analysis-whats-the-difference/ (2)</w:t>
+          <w:t>http</w:t>
+        </w:r>
+        <w:r>
+          <w:rPr>
+            <w:rStyle w:val="Hyperlink"/>
+            <w:sz w:val="20"/>
+            <w:szCs w:val="20"/>
+          </w:rPr>
+          <w:t>s</w:t>
+        </w:r>
+        <w:r>
+          <w:rPr>
+            <w:rStyle w:val="Hyperlink"/>
+            <w:sz w:val="20"/>
+            <w:szCs w:val="20"/>
+          </w:rPr>
+          <w:t>://www.algoface.ai/face-recognition-vs-face-analysis-whats-the-difference/ (2)</w:t>
         </w:r>
       </w:hyperlink>
+    </w:p>
+    <w:p>
+      <w:pPr>
+        <w:ind w:left="1440"/>
+        <w:rPr>
+          <w:sz w:val="16"/>
+          <w:szCs w:val="16"/>
+        </w:rPr>
+      </w:pPr>
+      <w:r>
+        <w:rPr>
+          <w:sz w:val="16"/>
+          <w:szCs w:val="16"/>
+        </w:rPr>
+        <w:t>Face analysis is the process of extracting meaning from a detect</w:t>
+      </w:r>
+      <w:r>
+        <w:rPr>
+          <w:sz w:val="16"/>
+          <w:szCs w:val="16"/>
+        </w:rPr>
+        <w:t>ed face. The goal is to obtain other kinds of information belonging to the person behind the face. “…</w:t>
+      </w:r>
+      <w:r>
+        <w:rPr>
+          <w:sz w:val="16"/>
+          <w:szCs w:val="16"/>
+        </w:rPr>
+        <w:t>face analysis doesn’t pursue identification or verification. Instead, it focuses on gathering actionable insights from facial expressions and positioning, without putting a name to the face.” (2)</w:t>
+      </w:r>
+      <w:r>
+        <w:rPr>
+          <w:sz w:val="16"/>
+          <w:szCs w:val="16"/>
+        </w:rPr>
+        <w:t xml:space="preserve"> Image segmentation datasets are used extensively when training face analysi</w:t>
+      </w:r>
+      <w:r>
+        <w:rPr>
+          <w:sz w:val="16"/>
+          <w:szCs w:val="16"/>
+        </w:rPr>
+        <w:t xml:space="preserve">s models. </w:t>
+      </w:r>
+      <w:r>
+        <w:rPr>
+          <w:sz w:val="16"/>
+          <w:szCs w:val="16"/>
+        </w:rPr>
+        <w:t xml:space="preserve">“Image </w:t>
+      </w:r>
+      <w:r>
+        <w:rPr>
+          <w:sz w:val="16"/>
+          <w:szCs w:val="16"/>
+        </w:rPr>
+        <w:lastRenderedPageBreak/>
+        <w:t>segmentation involves labeling each pixel of an image with a class.”</w:t>
+      </w:r>
+      <w:r>
+        <w:rPr>
+          <w:sz w:val="16"/>
+          <w:szCs w:val="16"/>
+        </w:rPr>
+        <w:t xml:space="preserve"> (3) </w:t>
+      </w:r>
+      <w:r>
+        <w:rPr>
+          <w:sz w:val="16"/>
+          <w:szCs w:val="16"/>
+        </w:rPr>
+        <w:t>The</w:t>
+      </w:r>
+      <w:r>
+        <w:rPr>
+          <w:sz w:val="16"/>
+          <w:szCs w:val="16"/>
+        </w:rPr>
+        <w:t xml:space="preserve"> ability to classify each pixel is essential when attempting to extract details from images or video frames.</w:t>
+      </w:r>
     </w:p>
     <w:p>
       <w:pPr>
@@ -2174,6 +2805,89 @@
     </w:p>
     <w:p>
       <w:pPr>
+        <w:ind w:left="1440"/>
+        <w:rPr>
+          <w:sz w:val="16"/>
+          <w:szCs w:val="16"/>
+        </w:rPr>
+      </w:pPr>
+      <w:r>
+        <w:rPr>
+          <w:sz w:val="16"/>
+          <w:szCs w:val="16"/>
+        </w:rPr>
+        <w:t>Face</w:t>
+      </w:r>
+      <w:r>
+        <w:rPr>
+          <w:sz w:val="16"/>
+          <w:szCs w:val="16"/>
+        </w:rPr>
+        <w:t xml:space="preserve"> recognition models are another way to use face detection</w:t>
+      </w:r>
+      <w:r>
+        <w:rPr>
+          <w:sz w:val="16"/>
+          <w:szCs w:val="16"/>
+        </w:rPr>
+        <w:t>. “</w:t>
+      </w:r>
+      <w:r>
+        <w:rPr>
+          <w:sz w:val="16"/>
+          <w:szCs w:val="16"/>
+        </w:rPr>
+        <w:t>Where face detection simply identifies the presence of a face in an image, face recognition either verifies or identifies an actual person.” (2)</w:t>
+      </w:r>
+      <w:r>
+        <w:rPr>
+          <w:sz w:val="16"/>
+          <w:szCs w:val="16"/>
+        </w:rPr>
+        <w:t xml:space="preserve"> This is one of the most essential capabilities for a model to have if it is going to be useful in surveillance. CNNs utilize special kinds of weights known as filters. Each filter is a small matrix of weights which </w:t>
+      </w:r>
+      <w:proofErr w:type="gramStart"/>
+      <w:r>
+        <w:rPr>
+          <w:sz w:val="16"/>
+          <w:szCs w:val="16"/>
+        </w:rPr>
+        <w:t>make</w:t>
+      </w:r>
+      <w:proofErr w:type="gramEnd"/>
+      <w:r>
+        <w:rPr>
+          <w:sz w:val="16"/>
+          <w:szCs w:val="16"/>
+        </w:rPr>
+        <w:t xml:space="preserve"> passes over the input data (usually an image or a video frame). During each pass it calculates a sum of its </w:t>
+      </w:r>
+      <w:proofErr w:type="gramStart"/>
+      <w:r>
+        <w:rPr>
+          <w:sz w:val="16"/>
+          <w:szCs w:val="16"/>
+        </w:rPr>
+        <w:t>weights</w:t>
+      </w:r>
+      <w:proofErr w:type="gramEnd"/>
+      <w:r>
+        <w:rPr>
+          <w:sz w:val="16"/>
+          <w:szCs w:val="16"/>
+        </w:rPr>
+        <w:t xml:space="preserve"> and the RGB values associated with the pixels it is currently covering. This sum represents a single output. After the matrix has passed over the entire image input, </w:t>
+      </w:r>
+      <w:r>
+        <w:rPr>
+          <w:sz w:val="16"/>
+          <w:szCs w:val="16"/>
+        </w:rPr>
+        <w:t>another image-like output has been generated which will be fed into the next convolutional layer. After a few of these layers process the original image input, the output is then flattened and fed into a traditional fully connected neural network.</w:t>
+      </w:r>
+    </w:p>
+    <w:p>
+      <w:pPr>
         <w:rPr>
           <w:sz w:val="20"/>
           <w:szCs w:val="20"/>
@@ -2207,6 +2921,22 @@
           <w:szCs w:val="20"/>
         </w:rPr>
         <w:t>: training datasets for computer vision</w:t>
+      </w:r>
+    </w:p>
+    <w:p>
+      <w:pPr>
+        <w:ind w:left="1440"/>
+        <w:rPr>
+          <w:sz w:val="16"/>
+          <w:szCs w:val="16"/>
+        </w:rPr>
+      </w:pPr>
+      <w:r>
+        <w:rPr>
+          <w:sz w:val="16"/>
+          <w:szCs w:val="16"/>
+        </w:rPr>
+        <w:t>Training datasets for these models consist of images. The images used for training the models discussed in Coded Bias would have been images of people or people’s faces.</w:t>
       </w:r>
     </w:p>
     <w:p>
@@ -2249,7 +2979,23 @@
             <w:sz w:val="20"/>
             <w:szCs w:val="20"/>
           </w:rPr>
-          <w:t>https://www.geeksforgeeks.org/computer-vision/computer-vision-datasets-1/#semantic-segmentation-datasets (3)</w:t>
+          <w:t>https://www.geeksforgeeks.org/computer-</w:t>
+        </w:r>
+        <w:r>
+          <w:rPr>
+            <w:rStyle w:val="Hyperlink"/>
+            <w:sz w:val="20"/>
+            <w:szCs w:val="20"/>
+          </w:rPr>
+          <w:t>v</w:t>
+        </w:r>
+        <w:r>
+          <w:rPr>
+            <w:rStyle w:val="Hyperlink"/>
+            <w:sz w:val="20"/>
+            <w:szCs w:val="20"/>
+          </w:rPr>
+          <w:t>ision/computer-vision-datasets-1/#semantic-segmentation-datasets (3)</w:t>
         </w:r>
       </w:hyperlink>
     </w:p>
@@ -2387,8 +3133,17 @@
           <w:szCs w:val="20"/>
         </w:rPr>
         <w:tab/>
-        <w:t>Subsubsection3.2.1: policing</w:t>
-      </w:r>
+        <w:t xml:space="preserve">Subsubsection3.2.1: </w:t>
+      </w:r>
+      <w:proofErr w:type="gramStart"/>
+      <w:r>
+        <w:rPr>
+          <w:sz w:val="20"/>
+          <w:szCs w:val="20"/>
+        </w:rPr>
+        <w:t>policing</w:t>
+      </w:r>
+      <w:proofErr w:type="gramEnd"/>
     </w:p>
     <w:p>
       <w:pPr>
@@ -2403,15 +3158,28 @@
           <w:sz w:val="16"/>
           <w:szCs w:val="16"/>
         </w:rPr>
-        <w:lastRenderedPageBreak/>
-        <w:t xml:space="preserve">Law enforcement and Policing take the main spotlight within the film. Within this area alone, there are many facets in which automation can be implemented. This first we will discuss is that of identification and </w:t>
-      </w:r>
-      <w:r>
-        <w:rPr>
-          <w:sz w:val="16"/>
-          <w:szCs w:val="16"/>
-        </w:rPr>
-        <w:t xml:space="preserve">surveillance. </w:t>
+        <w:t xml:space="preserve">Law enforcement and Policing take the main spotlight within the film. Within this area alone, there are many facets in which automation can be implemented. </w:t>
+      </w:r>
+      <w:r>
+        <w:rPr>
+          <w:sz w:val="16"/>
+          <w:szCs w:val="16"/>
+        </w:rPr>
+        <w:t>Automation has many uses in i</w:t>
+      </w:r>
+      <w:r>
+        <w:rPr>
+          <w:sz w:val="16"/>
+          <w:szCs w:val="16"/>
+        </w:rPr>
+        <w:t xml:space="preserve">dentification and </w:t>
+      </w:r>
+      <w:r>
+        <w:rPr>
+          <w:sz w:val="16"/>
+          <w:szCs w:val="16"/>
+        </w:rPr>
+        <w:t xml:space="preserve">surveillance </w:t>
       </w:r>
       <w:r>
         <w:rPr>
@@ -2440,6 +3208,13 @@
           <w:szCs w:val="16"/>
         </w:rPr>
         <w:t>mistaken arrests.</w:t>
+      </w:r>
+      <w:r>
+        <w:rPr>
+          <w:sz w:val="16"/>
+          <w:szCs w:val="16"/>
+        </w:rPr>
+        <w:t xml:space="preserve"> </w:t>
       </w:r>
     </w:p>
     <w:p>
@@ -2480,7 +3255,15 @@
           <w:sz w:val="20"/>
           <w:szCs w:val="20"/>
         </w:rPr>
-        <w:t>criminal justice contexts. These uses of AI can be significantly more accurate and efficient than human observations and comparisons, and they can provide entirely new capabilities. But these AI uses also pose concerns, especially related to errors, bias, and privacy. When harms associated with these AI uses occur, they can be serious, including mistaken arrests, with a potential for disproportionate impact on certain communities. There is substantial nationwide variation in policies about whether and how AI may be used for identification and surveillance in criminal justice contexts.</w:t>
+        <w:t xml:space="preserve">criminal justice contexts. These uses of AI can be significantly more accurate and efficient than human observations and comparisons, and they can provide entirely new capabilities. But these AI uses also pose concerns, especially related to errors, bias, and privacy. When harms associated with these AI uses occur, they can be serious, including mistaken arrests, with a potential for disproportionate impact on certain communities. There is substantial nationwide variation in policies about whether and how AI may be </w:t>
+      </w:r>
+      <w:r>
+        <w:rPr>
+          <w:sz w:val="20"/>
+          <w:szCs w:val="20"/>
+        </w:rPr>
+        <w:lastRenderedPageBreak/>
+        <w:t>used for identification and surveillance in criminal justice contexts.</w:t>
       </w:r>
       <w:r>
         <w:rPr>
@@ -2496,7 +3279,23 @@
             <w:sz w:val="20"/>
             <w:szCs w:val="20"/>
           </w:rPr>
-          <w:t>https://www.justice.gov/olp/media/1381796/dl?inline (4)</w:t>
+          <w:t>https://www.justice.gov/olp/media/1381796/dl</w:t>
+        </w:r>
+        <w:r>
+          <w:rPr>
+            <w:rStyle w:val="Hyperlink"/>
+            <w:sz w:val="20"/>
+            <w:szCs w:val="20"/>
+          </w:rPr>
+          <w:t>?</w:t>
+        </w:r>
+        <w:r>
+          <w:rPr>
+            <w:rStyle w:val="Hyperlink"/>
+            <w:sz w:val="20"/>
+            <w:szCs w:val="20"/>
+          </w:rPr>
+          <w:t>inline (4)</w:t>
         </w:r>
       </w:hyperlink>
     </w:p>
@@ -2563,7 +3362,21 @@
           <w:sz w:val="16"/>
           <w:szCs w:val="16"/>
         </w:rPr>
-        <w:t>Predictive policing is a particularly dangerous field to introduce automation. “</w:t>
+        <w:t xml:space="preserve">Predictive policing </w:t>
+      </w:r>
+      <w:r>
+        <w:rPr>
+          <w:sz w:val="16"/>
+          <w:szCs w:val="16"/>
+        </w:rPr>
+        <w:t>also makes use of</w:t>
+      </w:r>
+      <w:r>
+        <w:rPr>
+          <w:sz w:val="16"/>
+          <w:szCs w:val="16"/>
+        </w:rPr>
+        <w:t xml:space="preserve"> automation. “</w:t>
       </w:r>
       <w:r>
         <w:rPr>
@@ -2577,7 +3390,59 @@
           <w:sz w:val="16"/>
           <w:szCs w:val="16"/>
         </w:rPr>
-        <w:t xml:space="preserve">” (4) For example, if a region is over-policed, there are likely to be </w:t>
+        <w:t>” (4)</w:t>
+      </w:r>
+      <w:r>
+        <w:rPr>
+          <w:sz w:val="16"/>
+          <w:szCs w:val="16"/>
+        </w:rPr>
+        <w:t xml:space="preserve"> The fairness of automated system behavior can be compromised by the quality of the training data. If these algorithms learn from data representing a history of disproportionate policing, the model will amplify those biases, continuing these harmful imbalances.</w:t>
+      </w:r>
+    </w:p>
+    <w:p>
+      <w:pPr>
+        <w:ind w:left="1440"/>
+        <w:rPr>
+          <w:sz w:val="16"/>
+          <w:szCs w:val="16"/>
+        </w:rPr>
+      </w:pPr>
+    </w:p>
+    <w:p>
+      <w:pPr>
+        <w:ind w:left="1440"/>
+        <w:rPr>
+          <w:b/>
+          <w:bCs/>
+          <w:sz w:val="16"/>
+          <w:szCs w:val="16"/>
+        </w:rPr>
+      </w:pPr>
+      <w:r>
+        <w:rPr>
+          <w:b/>
+          <w:bCs/>
+          <w:sz w:val="16"/>
+          <w:szCs w:val="16"/>
+        </w:rPr>
+        <w:t>NOT USING THIS:</w:t>
+      </w:r>
+    </w:p>
+    <w:p>
+      <w:pPr>
+        <w:ind w:left="1440"/>
+        <w:rPr>
+          <w:sz w:val="16"/>
+          <w:szCs w:val="16"/>
+        </w:rPr>
+      </w:pPr>
+      <w:r>
+        <w:rPr>
+          <w:sz w:val="16"/>
+          <w:szCs w:val="16"/>
+        </w:rPr>
+        <w:t xml:space="preserve">For example, if a region is over-policed, there are likely to be </w:t>
       </w:r>
       <w:r>
         <w:rPr>
@@ -2598,21 +3463,7 @@
           <w:sz w:val="16"/>
           <w:szCs w:val="16"/>
         </w:rPr>
-        <w:t xml:space="preserve"> </w:t>
-      </w:r>
-      <w:r>
-        <w:rPr>
-          <w:sz w:val="16"/>
-          <w:szCs w:val="16"/>
-        </w:rPr>
-        <w:t>“The effectiveness and fairness of AI systems are compromised by the quality of the data used to train them. Algorithms learn from historical data, and when this data reflects a history of disproportionate policing, the AI will internalize and amplify those biases.</w:t>
-      </w:r>
-      <w:r>
-        <w:rPr>
-          <w:sz w:val="16"/>
-          <w:szCs w:val="16"/>
-        </w:rPr>
-        <w:t>” (9)</w:t>
+        <w:t xml:space="preserve"> “The effectiveness and fairness of AI systems are compromised by the quality of the data used to train them. Algorithms learn from historical data, and when this data reflects a history of disproportionate policing, the AI will internalize and amplify those biases.” (9)</w:t>
       </w:r>
     </w:p>
     <w:p>
@@ -2639,32 +3490,90 @@
           <w:sz w:val="20"/>
           <w:szCs w:val="20"/>
         </w:rPr>
-        <w:t xml:space="preserve">Predictive Policing. Law enforcement agencies use historical data to forecast the places where crime is likely to cluster and people who are at a higher risk of engaging in or being victims of criminal activity. Fundamental police work includes tracking where and when crimes occur, who is involved, and how crimes and people involved with crimes are connected. Developing accurate predictive models based on these types of data may help more efficiently direct resources—including non-law enforcement resources, such as social services—preventing crimes and decreasing response times. </w:t>
-      </w:r>
-      <w:r>
-        <w:rPr>
-          <w:sz w:val="20"/>
-          <w:szCs w:val="20"/>
+        <w:t xml:space="preserve">Predictive Policing. Law enforcement agencies use historical data to forecast the places where crime is likely to cluster and people who are at a higher risk of engaging in or being victims of criminal activity. Fundamental police work includes tracking where and when crimes occur, who is involved, and how crimes and people involved with crimes are connected. Developing accurate predictive models based on these types of data may help more efficiently direct </w:t>
+      </w:r>
+      <w:proofErr w:type="gramStart"/>
+      <w:r>
+        <w:rPr>
+          <w:sz w:val="20"/>
+          <w:szCs w:val="20"/>
+        </w:rPr>
+        <w:t>resources—</w:t>
+      </w:r>
+      <w:proofErr w:type="gramEnd"/>
+      <w:r>
+        <w:rPr>
+          <w:sz w:val="20"/>
+          <w:szCs w:val="20"/>
+        </w:rPr>
+        <w:t>including non-law enforcement resources, such as social services—preventing crimes and decreasing response times. But there are also significant risks associated with predictive policing. The data used for predictive policing may have significant gaps and errors, and it may reflect human biases. Use of models based on that data may entrench existing disparities and result in unintended consequences and unjust outcomes, such as over-policing of certain individuals and communities. Successful place-based predictive policing programs integrate a range of strategies and interventions to promote public safety. At the same time, some law enforcement agencies have shifted away from person-based predictive policing, citing limited value and impact on privacy and civil liberties.</w:t>
+      </w:r>
+      <w:r>
+        <w:rPr>
+          <w:sz w:val="20"/>
+          <w:szCs w:val="20"/>
+        </w:rPr>
+        <w:t>” (4)</w:t>
+      </w:r>
+    </w:p>
+    <w:p>
+      <w:pPr>
+        <w:ind w:left="1440"/>
+        <w:rPr>
+          <w:sz w:val="16"/>
+          <w:szCs w:val="16"/>
+        </w:rPr>
+      </w:pPr>
+      <w:r>
+        <w:rPr>
+          <w:sz w:val="16"/>
+          <w:szCs w:val="16"/>
+        </w:rPr>
+        <w:t>The last area we will discuss is risk assessment. Tools for risk assessment estimate the chance that s</w:t>
+      </w:r>
+      <w:r>
+        <w:rPr>
+          <w:sz w:val="16"/>
+          <w:szCs w:val="16"/>
+        </w:rPr>
+        <w:t xml:space="preserve">pecific outcomes will occur in the criminal justice system. </w:t>
+      </w:r>
+      <w:r>
+        <w:rPr>
+          <w:sz w:val="16"/>
+          <w:szCs w:val="16"/>
+        </w:rPr>
+        <w:t xml:space="preserve">These tools are widely used to inform pretrial release, </w:t>
+      </w:r>
+      <w:r>
+        <w:rPr>
+          <w:sz w:val="16"/>
+          <w:szCs w:val="16"/>
         </w:rPr>
         <w:lastRenderedPageBreak/>
-        <w:t>But there are also significant risks associated with predictive policing. The data used for predictive policing may have significant gaps and errors, and it may reflect human biases. Use of models based on that data may entrench existing disparities and result in unintended consequences and unjust outcomes, such as over-policing of certain individuals and communities. Successful place-based predictive policing programs integrate a range of strategies and interventions to promote public safety. At the same time, some law enforcement agencies have shifted away from person-based predictive policing, citing limited value and impact on privacy and civil liberties.</w:t>
-      </w:r>
-      <w:r>
-        <w:rPr>
-          <w:sz w:val="20"/>
-          <w:szCs w:val="20"/>
-        </w:rPr>
-        <w:t>” (4)</w:t>
-      </w:r>
-    </w:p>
-    <w:p>
-      <w:pPr>
-        <w:ind w:left="1440"/>
-        <w:rPr>
-          <w:sz w:val="16"/>
-          <w:szCs w:val="16"/>
-        </w:rPr>
-      </w:pPr>
+        <w:t>sentencing, prison classification, probation, parole, and supervision.</w:t>
+      </w:r>
+      <w:r>
+        <w:rPr>
+          <w:sz w:val="16"/>
+          <w:szCs w:val="16"/>
+        </w:rPr>
+        <w:t xml:space="preserve"> (4)</w:t>
+      </w:r>
+      <w:r>
+        <w:rPr>
+          <w:sz w:val="16"/>
+          <w:szCs w:val="16"/>
+        </w:rPr>
+        <w:t xml:space="preserve"> </w:t>
+      </w:r>
+      <w:r>
+        <w:rPr>
+          <w:sz w:val="16"/>
+          <w:szCs w:val="16"/>
+        </w:rPr>
+        <w:t>Obviously this can have negative side effects for anyone who is wrongly assessed.</w:t>
+      </w:r>
     </w:p>
     <w:p>
       <w:pPr>
@@ -2690,7 +3599,15 @@
           <w:sz w:val="20"/>
           <w:szCs w:val="20"/>
         </w:rPr>
-        <w:t>Risk Assessment. Risk assessment tools estimate the likelihood that a certain individual outcome will occur in the criminal justice system, such as recidivating or failing to appear in court. These tools are widely used to inform pretrial release, sentencing, prison classification, probation, parole, and supervision. Used properly, risk assessment tools can be more accurate than human judgment alone and can enable more targeted use of various tools within the criminal justice system. Risk assessment tools can also be more transparent and equitable than human judgments. There are, however, significant risks associated with these tools. Risk assessment tools can be inaccurate, especially when they are not validated on local data or fail to take into</w:t>
+        <w:t xml:space="preserve">Risk Assessment. Risk assessment tools estimate the likelihood that a certain individual outcome will occur in the criminal justice system, such as recidivating or failing to appear in court. These tools are widely used to inform pretrial release, sentencing, prison classification, probation, parole, and supervision. Used properly, risk assessment tools can be more accurate than human judgment alone and can enable more targeted use of various tools within the criminal justice system. Risk assessment tools can also be more transparent and equitable than human judgments. There are, however, significant risks associated with these tools. Risk assessment tools can be inaccurate, especially when they are not validated on local data or fail to </w:t>
+      </w:r>
+      <w:proofErr w:type="gramStart"/>
+      <w:r>
+        <w:rPr>
+          <w:sz w:val="20"/>
+          <w:szCs w:val="20"/>
+        </w:rPr>
+        <w:t>take into</w:t>
       </w:r>
       <w:r>
         <w:rPr>
@@ -2704,7 +3621,15 @@
           <w:sz w:val="20"/>
           <w:szCs w:val="20"/>
         </w:rPr>
-        <w:t>account relevant factors. They may be designed to estimate outcomes that are not directly relevant to the decision being made and thus fail to properly inform decisionmakers. Risk assessment tools can perpetuate bias and inequality, since the data used in building models may reflect errors or biases and the development process may not incorporate input from affected communities. Models may also be unnecessarily complex, lack transparency, and apply substantially different categorizations to similar people.</w:t>
+        <w:t>account</w:t>
+      </w:r>
+      <w:proofErr w:type="gramEnd"/>
+      <w:r>
+        <w:rPr>
+          <w:sz w:val="20"/>
+          <w:szCs w:val="20"/>
+        </w:rPr>
+        <w:t xml:space="preserve"> relevant factors. They may be designed to estimate outcomes that are not directly relevant to the decision being made and thus fail to properly inform decisionmakers. Risk assessment tools can perpetuate bias and inequality, since the data used in building models may reflect errors or biases and the development process may not incorporate input from affected communities. Models may also be unnecessarily complex, lack transparency, and apply substantially different categorizations to similar people.</w:t>
       </w:r>
       <w:r>
         <w:rPr>
@@ -2764,28 +3689,28 @@
           <w:sz w:val="16"/>
           <w:szCs w:val="16"/>
         </w:rPr>
-        <w:t xml:space="preserve">deciding merit for promotions. </w:t>
-      </w:r>
-      <w:r>
-        <w:rPr>
-          <w:sz w:val="16"/>
-          <w:szCs w:val="16"/>
-        </w:rPr>
-        <w:t>While these tools can bring myriad benefits, they can also exacerbate existing biases and contribute to discriminatory outcomes.</w:t>
-      </w:r>
-      <w:r>
-        <w:rPr>
-          <w:sz w:val="16"/>
-          <w:szCs w:val="16"/>
-        </w:rPr>
-        <w:t xml:space="preserve"> (5)</w:t>
-      </w:r>
-      <w:r>
-        <w:rPr>
-          <w:sz w:val="16"/>
-          <w:szCs w:val="16"/>
-        </w:rPr>
-        <w:t xml:space="preserve"> Minorities used to get the short end of the stick may be harmed even more by such systems. Humans are not perfect, but at least we cycle in and out of the workplace. An automated decision-making system could potentially be implemented and then left alone if it seems to be working for an unknown and potential extremely long period of time before anyone notices that it was favoring a specific demographic. The bias in such a system may never be noticed due to the subtlety of its effects. This is arguable one of the most dangerous outcomes.</w:t>
+        <w:t>deciding merit for promotions. While these tools can bring myriad benefits, they can also exacerbate existing biases and contribute to discriminatory outcomes. (5)</w:t>
+      </w:r>
+      <w:r>
+        <w:rPr>
+          <w:sz w:val="16"/>
+          <w:szCs w:val="16"/>
+        </w:rPr>
+        <w:t xml:space="preserve"> Minorities used to get the short end of the stick may be harmed even more by such systems. Humans are not perfect, but at least we cycle in and out of the workplace. An automated decision-making system could potentially be implemented and then left alone if it seems to be working for an unknown and potential extremely long period of time before anyone notices that it was favoring a specific demographic. The bias in such a system may never be noticed due to the subtlety of its effects. This is </w:t>
+      </w:r>
+      <w:r>
+        <w:rPr>
+          <w:sz w:val="16"/>
+          <w:szCs w:val="16"/>
+        </w:rPr>
+        <w:t>arguably</w:t>
+      </w:r>
+      <w:r>
+        <w:rPr>
+          <w:sz w:val="16"/>
+          <w:szCs w:val="16"/>
+        </w:rPr>
+        <w:t xml:space="preserve"> one of the most dangerous outcomes.</w:t>
       </w:r>
     </w:p>
     <w:p>
@@ -2828,7 +3753,7 @@
             <w:sz w:val="20"/>
             <w:szCs w:val="20"/>
           </w:rPr>
-          <w:t>https://calcivilrights.ca.gov/2025/06/30/civil-rights-council-secures-</w:t>
+          <w:t>https://calcivilrights.ca.gov/2025/06/30/civil-rights-council-secures-approval-for-regulations-to-protect-against-employment-discrimination-related-to-artificial-intelligence/</w:t>
         </w:r>
         <w:r>
           <w:rPr>
@@ -2836,8 +3761,15 @@
             <w:sz w:val="20"/>
             <w:szCs w:val="20"/>
           </w:rPr>
-          <w:lastRenderedPageBreak/>
-          <w:t>approval-for-regulations-to-protect-against-employment-discrimination-related-to-artificial-intelligence/ (5)</w:t>
+          <w:t xml:space="preserve"> </w:t>
+        </w:r>
+        <w:r>
+          <w:rPr>
+            <w:rStyle w:val="Hyperlink"/>
+            <w:sz w:val="20"/>
+            <w:szCs w:val="20"/>
+          </w:rPr>
+          <w:t>(5)</w:t>
         </w:r>
       </w:hyperlink>
     </w:p>
@@ -2862,6 +3794,93 @@
         </w:rPr>
         <w:tab/>
         <w:t>Subsubsection3.2.3: credit</w:t>
+      </w:r>
+    </w:p>
+    <w:p>
+      <w:pPr>
+        <w:ind w:left="1440"/>
+        <w:rPr>
+          <w:sz w:val="16"/>
+          <w:szCs w:val="16"/>
+        </w:rPr>
+      </w:pPr>
+      <w:r>
+        <w:rPr>
+          <w:sz w:val="16"/>
+          <w:szCs w:val="16"/>
+        </w:rPr>
+        <w:t>A machine learning model used</w:t>
+      </w:r>
+      <w:r>
+        <w:rPr>
+          <w:sz w:val="16"/>
+          <w:szCs w:val="16"/>
+        </w:rPr>
+        <w:t xml:space="preserve"> in a financial credibility system </w:t>
+      </w:r>
+      <w:r>
+        <w:rPr>
+          <w:sz w:val="16"/>
+          <w:szCs w:val="16"/>
+        </w:rPr>
+        <w:t>would reduce time spent on many tasks</w:t>
+      </w:r>
+      <w:r>
+        <w:rPr>
+          <w:sz w:val="16"/>
+          <w:szCs w:val="16"/>
+        </w:rPr>
+        <w:t xml:space="preserve">. </w:t>
+      </w:r>
+      <w:r>
+        <w:rPr>
+          <w:sz w:val="16"/>
+          <w:szCs w:val="16"/>
+        </w:rPr>
+        <w:t>“</w:t>
+      </w:r>
+      <w:r>
+        <w:rPr>
+          <w:sz w:val="16"/>
+          <w:szCs w:val="16"/>
+        </w:rPr>
+        <w:t>It automates document verification, income validation, fraud detection, and risk scoring in a single workflow, which improves operational efficiency.” (6)</w:t>
+      </w:r>
+      <w:r>
+        <w:rPr>
+          <w:sz w:val="16"/>
+          <w:szCs w:val="16"/>
+        </w:rPr>
+        <w:t xml:space="preserve"> These models will be used for predictive analysis tasks such as diving into a subject’s historical loan performance and borrower data and then using that information to potentially change </w:t>
+      </w:r>
+      <w:r>
+        <w:rPr>
+          <w:sz w:val="16"/>
+          <w:szCs w:val="16"/>
+        </w:rPr>
+        <w:lastRenderedPageBreak/>
+        <w:t>interest rates or loan access</w:t>
+      </w:r>
+      <w:r>
+        <w:rPr>
+          <w:sz w:val="16"/>
+          <w:szCs w:val="16"/>
+        </w:rPr>
+        <w:t>ibility. “</w:t>
+      </w:r>
+      <w:r>
+        <w:rPr>
+          <w:sz w:val="16"/>
+          <w:szCs w:val="16"/>
+        </w:rPr>
+        <w:t>It can also evaluate transaction behavior, spending habits, and repayment trends.</w:t>
+      </w:r>
+      <w:r>
+        <w:rPr>
+          <w:sz w:val="16"/>
+          <w:szCs w:val="16"/>
+        </w:rPr>
+        <w:t>” (6)</w:t>
       </w:r>
     </w:p>
     <w:p>
@@ -2911,7 +3930,23 @@
             <w:sz w:val="20"/>
             <w:szCs w:val="20"/>
           </w:rPr>
-          <w:t>https://www.analyticsinsight.net/artificial-intelligence/ai-in-credit-scoring-and-loan-approval-systems (6)</w:t>
+          <w:t>https://www.ana</w:t>
+        </w:r>
+        <w:r>
+          <w:rPr>
+            <w:rStyle w:val="Hyperlink"/>
+            <w:sz w:val="20"/>
+            <w:szCs w:val="20"/>
+          </w:rPr>
+          <w:t>l</w:t>
+        </w:r>
+        <w:r>
+          <w:rPr>
+            <w:rStyle w:val="Hyperlink"/>
+            <w:sz w:val="20"/>
+            <w:szCs w:val="20"/>
+          </w:rPr>
+          <w:t>yticsinsight.net/artificial-intelligence/ai-in-credit-scoring-and-loan-approval-systems (6)</w:t>
         </w:r>
       </w:hyperlink>
     </w:p>
@@ -2939,14 +3974,30 @@
           <w:sz w:val="20"/>
           <w:szCs w:val="20"/>
         </w:rPr>
-        <w:t>AI-based loan approval systems reduce decision-making time. It automates document verification, income validation, fraud detection, and risk scoring in a single workflow, which improves operational efficiency.</w:t>
-      </w:r>
-      <w:r>
-        <w:rPr>
-          <w:sz w:val="20"/>
-          <w:szCs w:val="20"/>
-        </w:rPr>
-        <w:t>” (6)</w:t>
+        <w:t xml:space="preserve">AI-based loan approval systems reduce decision-making time. It automates document verification, income validation, fraud detection, and risk scoring in a single workflow, which improves operational </w:t>
+      </w:r>
+      <w:proofErr w:type="gramStart"/>
+      <w:r>
+        <w:rPr>
+          <w:sz w:val="20"/>
+          <w:szCs w:val="20"/>
+        </w:rPr>
+        <w:t>efficiency.</w:t>
+      </w:r>
+      <w:r>
+        <w:rPr>
+          <w:sz w:val="20"/>
+          <w:szCs w:val="20"/>
+        </w:rPr>
+        <w:t>”</w:t>
+      </w:r>
+      <w:proofErr w:type="gramEnd"/>
+      <w:r>
+        <w:rPr>
+          <w:sz w:val="20"/>
+          <w:szCs w:val="20"/>
+        </w:rPr>
+        <w:t xml:space="preserve"> (6)</w:t>
       </w:r>
     </w:p>
     <w:p>
@@ -3017,7 +4068,39 @@
           <w:sz w:val="16"/>
           <w:szCs w:val="16"/>
         </w:rPr>
-        <w:t xml:space="preserve"> focus points of Coded Bias. The analysis be through the lens of social contract theory. I believe this ethical framework is most appropriate due to one of the most prominent sources of motivation for adoption of such systems of automation; public benefit.</w:t>
+        <w:t xml:space="preserve"> focus points of Coded Bias. The analysis </w:t>
+      </w:r>
+      <w:proofErr w:type="gramStart"/>
+      <w:r>
+        <w:rPr>
+          <w:sz w:val="16"/>
+          <w:szCs w:val="16"/>
+        </w:rPr>
+        <w:t>be</w:t>
+      </w:r>
+      <w:proofErr w:type="gramEnd"/>
+      <w:r>
+        <w:rPr>
+          <w:sz w:val="16"/>
+          <w:szCs w:val="16"/>
+        </w:rPr>
+        <w:t xml:space="preserve"> through the lens of social contract theory. I believe this ethical framework is most appropriate due to one of the most prominent sources of motivation for adoption of such systems of </w:t>
+      </w:r>
+      <w:proofErr w:type="gramStart"/>
+      <w:r>
+        <w:rPr>
+          <w:sz w:val="16"/>
+          <w:szCs w:val="16"/>
+        </w:rPr>
+        <w:t>automation;</w:t>
+      </w:r>
+      <w:proofErr w:type="gramEnd"/>
+      <w:r>
+        <w:rPr>
+          <w:sz w:val="16"/>
+          <w:szCs w:val="16"/>
+        </w:rPr>
+        <w:t xml:space="preserve"> public benefit.</w:t>
       </w:r>
     </w:p>
     <w:p>
@@ -3132,21 +4215,7 @@
           <w:sz w:val="16"/>
           <w:szCs w:val="16"/>
         </w:rPr>
-        <w:t>“The Fourth Amendment provides the primary legal framework governing AI surveillance, protecting individuals against unreasonable searches and seizures.</w:t>
-      </w:r>
-      <w:r>
-        <w:rPr>
-          <w:sz w:val="16"/>
-          <w:szCs w:val="16"/>
-        </w:rPr>
-        <w:t>” (9)</w:t>
-      </w:r>
-      <w:r>
-        <w:rPr>
-          <w:sz w:val="16"/>
-          <w:szCs w:val="16"/>
-        </w:rPr>
-        <w:t xml:space="preserve"> </w:t>
+        <w:t xml:space="preserve">“The Fourth Amendment provides the primary legal framework governing AI surveillance, protecting individuals against unreasonable searches and seizures.” (9) </w:t>
       </w:r>
       <w:r>
         <w:rPr>
@@ -3257,7 +4326,23 @@
             <w:sz w:val="20"/>
             <w:szCs w:val="20"/>
           </w:rPr>
-          <w:t>https://legalclarity.org/ai-in-policing-surveillance-bias-and-legal-challenges/ (9)</w:t>
+          <w:t>https://legalclarity.org/ai-in-policing-surveillance-bias-and-legal-chall</w:t>
+        </w:r>
+        <w:r>
+          <w:rPr>
+            <w:rStyle w:val="Hyperlink"/>
+            <w:sz w:val="20"/>
+            <w:szCs w:val="20"/>
+          </w:rPr>
+          <w:t>e</w:t>
+        </w:r>
+        <w:r>
+          <w:rPr>
+            <w:rStyle w:val="Hyperlink"/>
+            <w:sz w:val="20"/>
+            <w:szCs w:val="20"/>
+          </w:rPr>
+          <w:t>nges/ (9)</w:t>
         </w:r>
       </w:hyperlink>
     </w:p>
@@ -3285,7 +4370,23 @@
           <w:sz w:val="20"/>
           <w:szCs w:val="20"/>
         </w:rPr>
-        <w:t xml:space="preserve">The effectiveness and fairness of AI systems are compromised by the quality of the data used to train them. Algorithms learn from historical data, and when this data reflects a history of disproportionate policing, the AI will internalize and amplify those biases. For example, if historical records show higher arrest rates in certain communities due to over-policing, the predictive models will </w:t>
+        <w:t xml:space="preserve">The effectiveness and fairness of AI systems are compromised by the quality of the data used to train them. Algorithms </w:t>
+      </w:r>
+      <w:proofErr w:type="gramStart"/>
+      <w:r>
+        <w:rPr>
+          <w:sz w:val="20"/>
+          <w:szCs w:val="20"/>
+        </w:rPr>
+        <w:t>learn</w:t>
+      </w:r>
+      <w:proofErr w:type="gramEnd"/>
+      <w:r>
+        <w:rPr>
+          <w:sz w:val="20"/>
+          <w:szCs w:val="20"/>
+        </w:rPr>
+        <w:t xml:space="preserve"> from historical data, and when this data reflects a history of disproportionate policing, the AI will internalize and amplify those biases. For example, if historical records show higher arrest rates in certain communities due to over-policing, the predictive models will inaccurately flag those areas as high-risk. This creates a self-fulfilling prophecy </w:t>
       </w:r>
       <w:r>
         <w:rPr>
@@ -3293,7 +4394,7 @@
           <w:szCs w:val="20"/>
         </w:rPr>
         <w:lastRenderedPageBreak/>
-        <w:t>inaccurately flag those areas as high-risk. This creates a self-fulfilling prophecy where increased police presence leads to more arrests, which then reinforces the algorithm’s biased predictions.</w:t>
+        <w:t>where increased police presence leads to more arrests, which then reinforces the algorithm’s biased predictions.</w:t>
       </w:r>
       <w:r>
         <w:rPr>
@@ -3420,14 +4521,7 @@
           <w:sz w:val="20"/>
           <w:szCs w:val="20"/>
         </w:rPr>
-        <w:t xml:space="preserve"> </w:t>
-      </w:r>
-      <w:r>
-        <w:rPr>
-          <w:sz w:val="20"/>
-          <w:szCs w:val="20"/>
-        </w:rPr>
-        <w:t>through the lens of social contract theory</w:t>
+        <w:t xml:space="preserve"> through the lens of social contract theory</w:t>
       </w:r>
       <w:r>
         <w:rPr>
@@ -3491,7 +4585,39 @@
           <w:sz w:val="16"/>
           <w:szCs w:val="16"/>
         </w:rPr>
-        <w:t>Social contract theory believes in a set of rules governing how members of society should engage with one another. Regardless of the philosophical debate around machines and consciousness, the models we are building today have abilities that match and often exceed the abilities of humans within many fields. They are similar enough that training a ML model should in some respects be viewed similarly to training a human. If we would expect a human to be able to comprehend the rules of society which dictate how to treat other fairly and with respect, we should train our models to do the same.</w:t>
+        <w:t xml:space="preserve">Social contract theory believes in a set of rules governing how members of society should engage with one another. Regardless of the philosophical debate around machines and consciousness, the models we are building today have abilities that match and often exceed the abilities of humans within many fields. They are similar enough that training a ML model should in some respects be viewed similarly to training a human. If </w:t>
+      </w:r>
+      <w:proofErr w:type="gramStart"/>
+      <w:r>
+        <w:rPr>
+          <w:sz w:val="16"/>
+          <w:szCs w:val="16"/>
+        </w:rPr>
+        <w:t>we would</w:t>
+      </w:r>
+      <w:proofErr w:type="gramEnd"/>
+      <w:r>
+        <w:rPr>
+          <w:sz w:val="16"/>
+          <w:szCs w:val="16"/>
+        </w:rPr>
+        <w:t xml:space="preserve"> expect a human to be able to comprehend the rules of society which dictate how to treat </w:t>
+      </w:r>
+      <w:proofErr w:type="gramStart"/>
+      <w:r>
+        <w:rPr>
+          <w:sz w:val="16"/>
+          <w:szCs w:val="16"/>
+        </w:rPr>
+        <w:t>other</w:t>
+      </w:r>
+      <w:proofErr w:type="gramEnd"/>
+      <w:r>
+        <w:rPr>
+          <w:sz w:val="16"/>
+          <w:szCs w:val="16"/>
+        </w:rPr>
+        <w:t xml:space="preserve"> fairly and with respect, we should train our models to do the same.</w:t>
       </w:r>
     </w:p>
     <w:p>
@@ -3511,7 +4637,23 @@
           <w:sz w:val="20"/>
           <w:szCs w:val="20"/>
         </w:rPr>
-        <w:t>We should agree that without regulation, we have no way to systematically improve our society. And therefore we should agree that we should regulate any consequential technologies.</w:t>
+        <w:t xml:space="preserve">We should agree that without regulation, we have no way to systematically improve our society. And </w:t>
+      </w:r>
+      <w:proofErr w:type="gramStart"/>
+      <w:r>
+        <w:rPr>
+          <w:sz w:val="20"/>
+          <w:szCs w:val="20"/>
+        </w:rPr>
+        <w:t>therefore</w:t>
+      </w:r>
+      <w:proofErr w:type="gramEnd"/>
+      <w:r>
+        <w:rPr>
+          <w:sz w:val="20"/>
+          <w:szCs w:val="20"/>
+        </w:rPr>
+        <w:t xml:space="preserve"> we should agree that we should regulate any consequential technologies.</w:t>
       </w:r>
     </w:p>
     <w:p>
@@ -3566,12 +4708,69 @@
           <w:szCs w:val="16"/>
         </w:rPr>
       </w:pPr>
-      <w:r>
-        <w:rPr>
-          <w:sz w:val="16"/>
-          <w:szCs w:val="16"/>
-        </w:rPr>
-        <w:t>So if we expect our human members of society to learn and employ the standards set for all humans, we should either train our ML models with these same rules in mind or develop a specific set of rules which apply to automated systems. So the answer to this question would be “yes” and my personal take is that we should recognize the abilities and the differences of such models, and build a set of rules specifically designed for automated decision making systems.</w:t>
+      <w:proofErr w:type="gramStart"/>
+      <w:r>
+        <w:rPr>
+          <w:sz w:val="16"/>
+          <w:szCs w:val="16"/>
+        </w:rPr>
+        <w:t>So</w:t>
+      </w:r>
+      <w:proofErr w:type="gramEnd"/>
+      <w:r>
+        <w:rPr>
+          <w:sz w:val="16"/>
+          <w:szCs w:val="16"/>
+        </w:rPr>
+        <w:t xml:space="preserve"> if we expect our human members of society to learn and employ the standards set for all humans, we should either train our ML models with these same rules in mind or develop a specific set of rules which apply to automated systems. </w:t>
+      </w:r>
+      <w:proofErr w:type="gramStart"/>
+      <w:r>
+        <w:rPr>
+          <w:sz w:val="16"/>
+          <w:szCs w:val="16"/>
+        </w:rPr>
+        <w:t>So</w:t>
+      </w:r>
+      <w:proofErr w:type="gramEnd"/>
+      <w:r>
+        <w:rPr>
+          <w:sz w:val="16"/>
+          <w:szCs w:val="16"/>
+        </w:rPr>
+        <w:t xml:space="preserve"> the answer to this question would be “yes” and my personal take is that we should recognize the abilities and the differences of such </w:t>
+      </w:r>
+      <w:proofErr w:type="gramStart"/>
+      <w:r>
+        <w:rPr>
+          <w:sz w:val="16"/>
+          <w:szCs w:val="16"/>
+        </w:rPr>
+        <w:t>models, and</w:t>
+      </w:r>
+      <w:proofErr w:type="gramEnd"/>
+      <w:r>
+        <w:rPr>
+          <w:sz w:val="16"/>
+          <w:szCs w:val="16"/>
+        </w:rPr>
+        <w:t xml:space="preserve"> build a set of rules specifically designed for automated </w:t>
+      </w:r>
+      <w:proofErr w:type="gramStart"/>
+      <w:r>
+        <w:rPr>
+          <w:sz w:val="16"/>
+          <w:szCs w:val="16"/>
+        </w:rPr>
+        <w:t>decision making</w:t>
+      </w:r>
+      <w:proofErr w:type="gramEnd"/>
+      <w:r>
+        <w:rPr>
+          <w:sz w:val="16"/>
+          <w:szCs w:val="16"/>
+        </w:rPr>
+        <w:t xml:space="preserve"> systems.</w:t>
       </w:r>
     </w:p>
     <w:p>
@@ -3591,7 +4790,23 @@
           <w:sz w:val="20"/>
           <w:szCs w:val="20"/>
         </w:rPr>
-        <w:t>We should agree that stifling our creativity without reason to believe it will cause unavoidable harm is in itself a harmful thing.</w:t>
+        <w:t xml:space="preserve">We should agree that stifling our creativity without reason to believe it will cause unavoidable harm is </w:t>
+      </w:r>
+      <w:proofErr w:type="gramStart"/>
+      <w:r>
+        <w:rPr>
+          <w:sz w:val="20"/>
+          <w:szCs w:val="20"/>
+        </w:rPr>
+        <w:t>in itself a</w:t>
+      </w:r>
+      <w:proofErr w:type="gramEnd"/>
+      <w:r>
+        <w:rPr>
+          <w:sz w:val="20"/>
+          <w:szCs w:val="20"/>
+        </w:rPr>
+        <w:t xml:space="preserve"> harmful thing.</w:t>
       </w:r>
     </w:p>
     <w:p>
@@ -3641,14 +4856,7 @@
           <w:sz w:val="20"/>
           <w:szCs w:val="20"/>
         </w:rPr>
-        <w:t xml:space="preserve"> </w:t>
-      </w:r>
-      <w:r>
-        <w:rPr>
-          <w:sz w:val="20"/>
-          <w:szCs w:val="20"/>
-        </w:rPr>
-        <w:t>through the lens of social contract theory</w:t>
+        <w:t xml:space="preserve"> through the lens of social contract theory</w:t>
       </w:r>
       <w:r>
         <w:rPr>
@@ -3705,15 +4913,7 @@
           <w:sz w:val="16"/>
           <w:szCs w:val="16"/>
         </w:rPr>
-        <w:t xml:space="preserve">The last question we will ask in this paper is “Given what we have seen, how should we handle the existing bias in the worlds technological infrastructure?” Simply the fact that we have created and implemented automated systems that contain bias suggests a few things about the state of the world. Does this mean we have neglected to define social contracts within our societies? Does this mean we don’t consider a contract to be social if it pertains to the development of a new piece of technology? Does this mean that the world views laws governing the development and implementation of new technologies to </w:t>
-      </w:r>
-      <w:r>
-        <w:rPr>
-          <w:sz w:val="16"/>
-          <w:szCs w:val="16"/>
-        </w:rPr>
-        <w:lastRenderedPageBreak/>
-        <w:t xml:space="preserve">be an infringement of </w:t>
+        <w:t xml:space="preserve">The last question we will ask in this paper is “Given what we have seen, how should we handle the existing bias in the worlds technological infrastructure?” Simply the fact that we have created and implemented automated systems that contain bias suggests a few things about the state of the world. Does this mean we have neglected to define social contracts within our societies? Does this mean we don’t consider a contract to be social if it pertains to the development of a new piece of technology? Does this mean that the world views laws governing the development and implementation of new technologies to be an infringement of </w:t>
       </w:r>
       <w:r>
         <w:rPr>
@@ -3734,7 +4934,23 @@
           <w:sz w:val="16"/>
           <w:szCs w:val="16"/>
         </w:rPr>
-        <w:t xml:space="preserve"> and this is probably due to an absence of relevant social contracts.</w:t>
+        <w:t xml:space="preserve"> and this is probably due to </w:t>
+      </w:r>
+      <w:proofErr w:type="gramStart"/>
+      <w:r>
+        <w:rPr>
+          <w:sz w:val="16"/>
+          <w:szCs w:val="16"/>
+        </w:rPr>
+        <w:t>an</w:t>
+      </w:r>
+      <w:proofErr w:type="gramEnd"/>
+      <w:r>
+        <w:rPr>
+          <w:sz w:val="16"/>
+          <w:szCs w:val="16"/>
+        </w:rPr>
+        <w:t xml:space="preserve"> absence of relevant social contracts.</w:t>
       </w:r>
     </w:p>
     <w:p>
@@ -3754,6 +4970,7 @@
           <w:sz w:val="20"/>
           <w:szCs w:val="20"/>
         </w:rPr>
+        <w:lastRenderedPageBreak/>
         <w:t xml:space="preserve">We should agree that active harm is being done </w:t>
       </w:r>
       <w:r>
@@ -3927,7 +5144,55 @@
           <w:szCs w:val="20"/>
         </w:rPr>
         <w:tab/>
-        <w:t>Subsection5.1: the road from development to real-world implementation. (we should be free to develop new technologies in isolation in order to allow our curiosity to flourish, but it should NOT be considered normal to implement or sell a new technology before it is thoroughly vetted for flaws)</w:t>
+        <w:t>Subsection5.1: the road from development to real-world implementation. (</w:t>
+      </w:r>
+      <w:proofErr w:type="gramStart"/>
+      <w:r>
+        <w:rPr>
+          <w:sz w:val="20"/>
+          <w:szCs w:val="20"/>
+        </w:rPr>
+        <w:t>we</w:t>
+      </w:r>
+      <w:proofErr w:type="gramEnd"/>
+      <w:r>
+        <w:rPr>
+          <w:sz w:val="20"/>
+          <w:szCs w:val="20"/>
+        </w:rPr>
+        <w:t xml:space="preserve"> should be free to develop new technologies in isolation </w:t>
+      </w:r>
+      <w:proofErr w:type="gramStart"/>
+      <w:r>
+        <w:rPr>
+          <w:sz w:val="20"/>
+          <w:szCs w:val="20"/>
+        </w:rPr>
+        <w:t>in order to</w:t>
+      </w:r>
+      <w:proofErr w:type="gramEnd"/>
+      <w:r>
+        <w:rPr>
+          <w:sz w:val="20"/>
+          <w:szCs w:val="20"/>
+        </w:rPr>
+        <w:t xml:space="preserve"> allow our curiosity to flourish, but it should NOT be considered normal to implement or sell </w:t>
+      </w:r>
+      <w:proofErr w:type="gramStart"/>
+      <w:r>
+        <w:rPr>
+          <w:sz w:val="20"/>
+          <w:szCs w:val="20"/>
+        </w:rPr>
+        <w:t>a new</w:t>
+      </w:r>
+      <w:proofErr w:type="gramEnd"/>
+      <w:r>
+        <w:rPr>
+          <w:sz w:val="20"/>
+          <w:szCs w:val="20"/>
+        </w:rPr>
+        <w:t xml:space="preserve"> technology before it is thoroughly vetted for flaws)</w:t>
       </w:r>
     </w:p>
     <w:p>
@@ -3949,7 +5214,23 @@
           <w:sz w:val="16"/>
           <w:szCs w:val="16"/>
         </w:rPr>
-        <w:t xml:space="preserve">As citizens, we should push for strong, clear regulation of development pipelines in all industries. It is naïve to assume our creative endeavors will yield risk free results. But we must strive to walk a fine line. Constricting creative freedom too much will stifle humanities ability to grow and change with the world. And no limitations will breed an abundance of thoughtless harm. We must seek a global balance. Technological innovation and the capacity of such creations have force humanity into a global community. We must recognize </w:t>
+        <w:t xml:space="preserve">As citizens, we should push for strong, clear </w:t>
+      </w:r>
+      <w:proofErr w:type="gramStart"/>
+      <w:r>
+        <w:rPr>
+          <w:sz w:val="16"/>
+          <w:szCs w:val="16"/>
+        </w:rPr>
+        <w:t>regulation</w:t>
+      </w:r>
+      <w:proofErr w:type="gramEnd"/>
+      <w:r>
+        <w:rPr>
+          <w:sz w:val="16"/>
+          <w:szCs w:val="16"/>
+        </w:rPr>
+        <w:t xml:space="preserve"> of development pipelines in all industries. It is naïve to assume our creative endeavors will yield risk free results. But we must strive to walk a fine line. Constricting creative freedom too much will stifle humanities ability to grow and change with the world. And no limitations will breed an abundance of thoughtless harm. We must seek a global balance. Technological innovation and the capacity of such creations have force humanity into a global community. We must recognize </w:t>
       </w:r>
       <w:r>
         <w:rPr>
@@ -4033,7 +5314,23 @@
           <w:sz w:val="16"/>
           <w:szCs w:val="16"/>
         </w:rPr>
-        <w:t>, it is clear to me that I’m learning many foundational skills required of an engineer who will eventually be pushing the state of the art in software. I have specifically opted to take machine learning courses as part of my elective course load, and I now have a basic understanding of how to implement the same kinds of algorithms as are discussed in Coded Bias. Even if the world does not impose such expectations upon me, I will be seeking to diversify my perspectives on any and all projects I work on. I will seek to find the flaws or vulnerabilities in whatever systems I end up building, testing, or implementing in the world. If I can, I will try to build systems without strong bias, and without the ability to use existing bias to cause great harm.</w:t>
+        <w:t xml:space="preserve">, it is clear to me that I’m learning many foundational skills required of an engineer who will eventually be pushing the state of the art in software. I have specifically opted to take machine learning courses as part of my elective course load, and I now have a basic understanding of how to implement the same kinds of algorithms as are discussed in Coded Bias. Even if the world does not impose such expectations upon me, I will be seeking to diversify my perspectives on </w:t>
+      </w:r>
+      <w:proofErr w:type="gramStart"/>
+      <w:r>
+        <w:rPr>
+          <w:sz w:val="16"/>
+          <w:szCs w:val="16"/>
+        </w:rPr>
+        <w:t>any and all</w:t>
+      </w:r>
+      <w:proofErr w:type="gramEnd"/>
+      <w:r>
+        <w:rPr>
+          <w:sz w:val="16"/>
+          <w:szCs w:val="16"/>
+        </w:rPr>
+        <w:t xml:space="preserve"> projects I work on. I will seek to find the flaws or vulnerabilities in whatever systems I end up building, testing, or implementing in the world. If I can, I will try to build systems without strong bias, and without the ability to use existing bias to cause great harm.</w:t>
       </w:r>
     </w:p>
     <w:p>
@@ -4278,22 +5575,22 @@
           <w:sz w:val="20"/>
           <w:szCs w:val="20"/>
         </w:rPr>
+        <w:t>• Kantianism</w:t>
+      </w:r>
+    </w:p>
+    <w:p>
+      <w:pPr>
+        <w:rPr>
+          <w:sz w:val="20"/>
+          <w:szCs w:val="20"/>
+        </w:rPr>
+      </w:pPr>
+      <w:r>
+        <w:rPr>
+          <w:sz w:val="20"/>
+          <w:szCs w:val="20"/>
+        </w:rPr>
         <w:lastRenderedPageBreak/>
-        <w:t>• Kantianism</w:t>
-      </w:r>
-    </w:p>
-    <w:p>
-      <w:pPr>
-        <w:rPr>
-          <w:sz w:val="20"/>
-          <w:szCs w:val="20"/>
-        </w:rPr>
-      </w:pPr>
-      <w:r>
-        <w:rPr>
-          <w:sz w:val="20"/>
-          <w:szCs w:val="20"/>
-        </w:rPr>
         <w:t>• Act Utilitarianism (provide quantifiable metrics to support your conclusion)</w:t>
       </w:r>
     </w:p>
@@ -4339,7 +5636,23 @@
           <w:sz w:val="20"/>
           <w:szCs w:val="20"/>
         </w:rPr>
-        <w:t>Your report should be submitted using the ACM template, and be at least 5-6 pages in length. You are encouraged to search for reliable sources (use at least 10 distinct sources) and cite them with appropriate reference format.</w:t>
+        <w:t xml:space="preserve">Your report should be submitted using the ACM </w:t>
+      </w:r>
+      <w:proofErr w:type="gramStart"/>
+      <w:r>
+        <w:rPr>
+          <w:sz w:val="20"/>
+          <w:szCs w:val="20"/>
+        </w:rPr>
+        <w:t>template, and</w:t>
+      </w:r>
+      <w:proofErr w:type="gramEnd"/>
+      <w:r>
+        <w:rPr>
+          <w:sz w:val="20"/>
+          <w:szCs w:val="20"/>
+        </w:rPr>
+        <w:t xml:space="preserve"> be at least 5-6 pages in length. You are encouraged to search for reliable sources (use at least 10 distinct sources) and cite them with appropriate reference format.</w:t>
       </w:r>
     </w:p>
     <w:p>
@@ -6176,15 +7489,6 @@
 </file>
 
 <file path=customXml/item2.xml><?xml version="1.0" encoding="utf-8"?>
-<?mso-contentType ?>
-<FormTemplates xmlns="http://schemas.microsoft.com/sharepoint/v3/contenttype/forms">
-  <Display>DocumentLibraryForm</Display>
-  <Edit>DocumentLibraryForm</Edit>
-  <New>DocumentLibraryForm</New>
-</FormTemplates>
-</file>
-
-<file path=customXml/item3.xml><?xml version="1.0" encoding="utf-8"?>
 <ct:contentTypeSchema xmlns:ct="http://schemas.microsoft.com/office/2006/metadata/contentType" xmlns:ma="http://schemas.microsoft.com/office/2006/metadata/properties/metaAttributes" ct:_="" ma:_="" ma:contentTypeName="Document" ma:contentTypeID="0x010100999759AE1BE45D40BF4DB7F9E6469A5F" ma:contentTypeVersion="14" ma:contentTypeDescription="Create a new document." ma:contentTypeScope="" ma:versionID="0f726a4f92361575e7e2661863ddd970">
   <xsd:schema xmlns:xsd="http://www.w3.org/2001/XMLSchema" xmlns:xs="http://www.w3.org/2001/XMLSchema" xmlns:p="http://schemas.microsoft.com/office/2006/metadata/properties" xmlns:ns3="46c4c001-5411-4ae7-ac51-f14020e513cb" xmlns:ns4="4a036c64-65d3-4834-9b0c-f7228bc52437" targetNamespace="http://schemas.microsoft.com/office/2006/metadata/properties" ma:root="true" ma:fieldsID="ab8968189ca634ec4fbd10fd6cebeae1" ns3:_="" ns4:_="">
     <xsd:import namespace="46c4c001-5411-4ae7-ac51-f14020e513cb"/>
@@ -6409,6 +7713,15 @@
 </ct:contentTypeSchema>
 </file>
 
+<file path=customXml/item3.xml><?xml version="1.0" encoding="utf-8"?>
+<?mso-contentType ?>
+<FormTemplates xmlns="http://schemas.microsoft.com/sharepoint/v3/contenttype/forms">
+  <Display>DocumentLibraryForm</Display>
+  <Edit>DocumentLibraryForm</Edit>
+  <New>DocumentLibraryForm</New>
+</FormTemplates>
+</file>
+
 <file path=customXml/itemProps1.xml><?xml version="1.0" encoding="utf-8"?>
 <ds:datastoreItem xmlns:ds="http://schemas.openxmlformats.org/officeDocument/2006/customXml" ds:itemID="{B79B83D2-35BA-4DF1-83F0-5D13BCF72A27}">
   <ds:schemaRefs>
@@ -6420,14 +7733,6 @@
 </file>
 
 <file path=customXml/itemProps2.xml><?xml version="1.0" encoding="utf-8"?>
-<ds:datastoreItem xmlns:ds="http://schemas.openxmlformats.org/officeDocument/2006/customXml" ds:itemID="{C4D671E0-FFF5-482F-9589-8EA74E504EAA}">
-  <ds:schemaRefs>
-    <ds:schemaRef ds:uri="http://schemas.microsoft.com/sharepoint/v3/contenttype/forms"/>
-  </ds:schemaRefs>
-</ds:datastoreItem>
-</file>
-
-<file path=customXml/itemProps3.xml><?xml version="1.0" encoding="utf-8"?>
 <ds:datastoreItem xmlns:ds="http://schemas.openxmlformats.org/officeDocument/2006/customXml" ds:itemID="{8B0E87F3-2C1A-4713-900E-2B8F96814D56}">
   <ds:schemaRefs>
     <ds:schemaRef ds:uri="http://schemas.microsoft.com/office/2006/metadata/contentType"/>
@@ -6444,4 +7749,12 @@
     <ds:schemaRef ds:uri="http://schemas.microsoft.com/internal/obd"/>
   </ds:schemaRefs>
 </ds:datastoreItem>
+</file>
+
+<file path=customXml/itemProps3.xml><?xml version="1.0" encoding="utf-8"?>
+<ds:datastoreItem xmlns:ds="http://schemas.openxmlformats.org/officeDocument/2006/customXml" ds:itemID="{C4D671E0-FFF5-482F-9589-8EA74E504EAA}">
+  <ds:schemaRefs>
+    <ds:schemaRef ds:uri="http://schemas.microsoft.com/sharepoint/v3/contenttype/forms"/>
+  </ds:schemaRefs>
+</ds:datastoreItem>
 </file>
</xml_diff>